<commit_message>
tilføjelser af pdf til aflevering
</commit_message>
<xml_diff>
--- a/1. portfolio projekt.docx
+++ b/1. portfolio projekt.docx
@@ -2,7 +2,6 @@
 <file path=word/document.xml><?xml version="1.0" encoding="utf-8"?>
 <w:document xmlns:wpc="http://schemas.microsoft.com/office/word/2010/wordprocessingCanvas" xmlns:cx="http://schemas.microsoft.com/office/drawing/2014/chartex" xmlns:cx1="http://schemas.microsoft.com/office/drawing/2015/9/8/chartex" xmlns:cx2="http://schemas.microsoft.com/office/drawing/2015/10/21/chartex" xmlns:cx3="http://schemas.microsoft.com/office/drawing/2016/5/9/chartex" xmlns:cx4="http://schemas.microsoft.com/office/drawing/2016/5/10/chartex" xmlns:cx5="http://schemas.microsoft.com/office/drawing/2016/5/11/chartex" xmlns:cx6="http://schemas.microsoft.com/office/drawing/2016/5/12/chartex" xmlns:cx7="http://schemas.microsoft.com/office/drawing/2016/5/13/chartex" xmlns:cx8="http://schemas.microsoft.com/office/drawing/2016/5/14/chartex" xmlns:mc="http://schemas.openxmlformats.org/markup-compatibility/2006" xmlns:m="http://schemas.openxmlformats.org/officeDocument/2006/math" xmlns:aink="http://schemas.microsoft.com/office/drawing/2016/ink" xmlns:am3d="http://schemas.microsoft.com/office/drawing/2017/model3d" xmlns:oel="http://schemas.microsoft.com/office/2019/extlst" xmlns:r="http://schemas.openxmlformats.org/officeDocument/2006/relationships" xmlns:wp14="http://schemas.microsoft.com/office/word/2010/wordprocessingDrawing" xmlns:wp="http://schemas.openxmlformats.org/drawingml/2006/wordprocessingDrawing" xmlns:wpg="http://schemas.microsoft.com/office/word/2010/wordprocessingGroup" xmlns:wpi="http://schemas.microsoft.com/office/word/2010/wordprocessingInk" xmlns:wps="http://schemas.microsoft.com/office/word/2010/wordprocessingShape" xmlns:o="urn:schemas-microsoft-com:office:office" xmlns:v="urn:schemas-microsoft-com:vml" xmlns:w10="urn:schemas-microsoft-com:office:word" xmlns:w="http://schemas.openxmlformats.org/wordprocessingml/2006/main" xmlns:w14="http://schemas.microsoft.com/office/word/2010/wordml" xmlns:w15="http://schemas.microsoft.com/office/word/2012/wordml" xmlns:w16cex="http://schemas.microsoft.com/office/word/2018/wordml/cex" xmlns:w16cid="http://schemas.microsoft.com/office/word/2016/wordml/cid" xmlns:w16="http://schemas.microsoft.com/office/word/2018/wordml" xmlns:w16sdtdh="http://schemas.microsoft.com/office/word/2020/wordml/sdtdatahash" xmlns:w16sdtfl="http://schemas.microsoft.com/office/word/2024/wordml/sdtformatlock" xmlns:w16se="http://schemas.microsoft.com/office/word/2015/wordml/symex" xmlns:w16du="http://schemas.microsoft.com/office/word/2023/wordml/word16du" xmlns:wne="http://schemas.microsoft.com/office/word/2006/wordml" mc:Ignorable="w14 w15 w16se w16cid w16 w16cex w16sdtdh w16sdtfl w16du wp14">
   <w:body>
-    <w:p/>
     <w:p>
       <w:pPr>
         <w:jc w:val="center"/>
@@ -31,6 +30,8 @@
         <w:rPr>
           <w:b/>
           <w:bCs/>
+          <w:sz w:val="28"/>
+          <w:szCs w:val="28"/>
           <w:u w:val="single"/>
         </w:rPr>
       </w:pPr>
@@ -38,6 +39,8 @@
         <w:rPr>
           <w:b/>
           <w:bCs/>
+          <w:sz w:val="28"/>
+          <w:szCs w:val="28"/>
           <w:u w:val="single"/>
         </w:rPr>
         <w:t>Scope</w:t>
@@ -45,13 +48,69 @@
     </w:p>
     <w:p>
       <w:pPr>
+        <w:spacing w:before="100" w:beforeAutospacing="1" w:after="100" w:afterAutospacing="1" w:line="240" w:lineRule="auto"/>
         <w:jc w:val="both"/>
-      </w:pPr>
+        <w:rPr>
+          <w:rFonts w:eastAsia="Times New Roman" w:cs="Times New Roman"/>
+          <w:color w:val="000000"/>
+          <w:kern w:val="0"/>
+          <w:lang w:eastAsia="da-DK"/>
+          <w14:ligatures w14:val="none"/>
+        </w:rPr>
+      </w:pPr>
+      <w:r>
+        <w:rPr>
+          <w:rFonts w:eastAsia="Times New Roman" w:cs="Times New Roman"/>
+          <w:color w:val="000000"/>
+          <w:kern w:val="0"/>
+          <w:lang w:eastAsia="da-DK"/>
+          <w14:ligatures w14:val="none"/>
+        </w:rPr>
+        <w:t>Mit mål med projektet er at lave en personlig portfolio-hjemmeside i HTML og CSS, hvor man kan læse om mig, min uddannelse, arbejdserfaring og se mine kontaktoplysninger. Jeg vil gerne lave en forside med navigation og eventuelt flere HTML-sider, så de forskellige punkter i navigationen får deres egen side.</w:t>
+      </w:r>
     </w:p>
     <w:p>
       <w:pPr>
+        <w:spacing w:before="100" w:beforeAutospacing="1" w:after="100" w:afterAutospacing="1" w:line="240" w:lineRule="auto"/>
         <w:jc w:val="both"/>
-      </w:pPr>
+        <w:rPr>
+          <w:rFonts w:eastAsia="Times New Roman" w:cs="Times New Roman"/>
+          <w:color w:val="000000"/>
+          <w:kern w:val="0"/>
+          <w:lang w:eastAsia="da-DK"/>
+          <w14:ligatures w14:val="none"/>
+        </w:rPr>
+      </w:pPr>
+      <w:r>
+        <w:rPr>
+          <w:rFonts w:eastAsia="Times New Roman" w:cs="Times New Roman"/>
+          <w:color w:val="000000"/>
+          <w:kern w:val="0"/>
+          <w:lang w:eastAsia="da-DK"/>
+          <w14:ligatures w14:val="none"/>
+        </w:rPr>
+        <w:t xml:space="preserve">Jeg vil arbejde med et gennemgående design med farver, typografi, billeder, ikoner og et logo. Hjemmesiden </w:t>
+      </w:r>
+      <w:r>
+        <w:rPr>
+          <w:rFonts w:eastAsia="Times New Roman" w:cs="Times New Roman"/>
+          <w:color w:val="000000"/>
+          <w:kern w:val="0"/>
+          <w:lang w:eastAsia="da-DK"/>
+          <w14:ligatures w14:val="none"/>
+        </w:rPr>
+        <w:t>vil jeg også gøre</w:t>
+      </w:r>
+      <w:r>
+        <w:rPr>
+          <w:rFonts w:eastAsia="Times New Roman" w:cs="Times New Roman"/>
+          <w:color w:val="000000"/>
+          <w:kern w:val="0"/>
+          <w:lang w:eastAsia="da-DK"/>
+          <w14:ligatures w14:val="none"/>
+        </w:rPr>
+        <w:t xml:space="preserve"> responsiv, så den fungerer på både computer og mobil. </w:t>
+      </w:r>
     </w:p>
     <w:p>
       <w:pPr>
@@ -64,6 +123,8 @@
         <w:rPr>
           <w:b/>
           <w:bCs/>
+          <w:sz w:val="28"/>
+          <w:szCs w:val="28"/>
           <w:u w:val="single"/>
         </w:rPr>
       </w:pPr>
@@ -71,9 +132,11 @@
         <w:rPr>
           <w:b/>
           <w:bCs/>
+          <w:sz w:val="28"/>
+          <w:szCs w:val="28"/>
           <w:u w:val="single"/>
         </w:rPr>
-        <w:t>MoSCoW Prioritering</w:t>
+        <w:t xml:space="preserve">MoSCoW </w:t>
       </w:r>
     </w:p>
     <w:tbl>
@@ -90,7 +153,7 @@
         <w:tc>
           <w:tcPr>
             <w:tcW w:w="1838" w:type="dxa"/>
-            <w:shd w:val="clear" w:color="auto" w:fill="808080" w:themeFill="background1" w:themeFillShade="80"/>
+            <w:shd w:val="clear" w:color="auto" w:fill="8DD873" w:themeFill="accent6" w:themeFillTint="99"/>
           </w:tcPr>
           <w:p>
             <w:pPr>
@@ -113,11 +176,23 @@
         <w:tc>
           <w:tcPr>
             <w:tcW w:w="7790" w:type="dxa"/>
-            <w:shd w:val="clear" w:color="auto" w:fill="BFBFBF" w:themeFill="background1" w:themeFillShade="BF"/>
+            <w:shd w:val="clear" w:color="auto" w:fill="D9F2D0" w:themeFill="accent6" w:themeFillTint="33"/>
           </w:tcPr>
           <w:p>
             <w:r>
-              <w:t>Scope, dermed html-krav og standardkrav af css</w:t>
+              <w:t>HTML</w:t>
+            </w:r>
+            <w:r>
+              <w:t>-krav</w:t>
+            </w:r>
+            <w:r>
+              <w:t xml:space="preserve">, </w:t>
+            </w:r>
+            <w:r>
+              <w:t>standardkrav af css</w:t>
+            </w:r>
+            <w:r>
+              <w:t xml:space="preserve"> og nødvendigt indhold</w:t>
             </w:r>
           </w:p>
         </w:tc>
@@ -126,7 +201,7 @@
         <w:tc>
           <w:tcPr>
             <w:tcW w:w="1838" w:type="dxa"/>
-            <w:shd w:val="clear" w:color="auto" w:fill="808080" w:themeFill="background1" w:themeFillShade="80"/>
+            <w:shd w:val="clear" w:color="auto" w:fill="8DD873" w:themeFill="accent6" w:themeFillTint="99"/>
           </w:tcPr>
           <w:p>
             <w:pPr>
@@ -159,7 +234,7 @@
         <w:tc>
           <w:tcPr>
             <w:tcW w:w="7790" w:type="dxa"/>
-            <w:shd w:val="clear" w:color="auto" w:fill="BFBFBF" w:themeFill="background1" w:themeFillShade="BF"/>
+            <w:shd w:val="clear" w:color="auto" w:fill="D9F2D0" w:themeFill="accent6" w:themeFillTint="33"/>
           </w:tcPr>
           <w:p>
             <w:r>
@@ -172,7 +247,7 @@
         <w:tc>
           <w:tcPr>
             <w:tcW w:w="1838" w:type="dxa"/>
-            <w:shd w:val="clear" w:color="auto" w:fill="808080" w:themeFill="background1" w:themeFillShade="80"/>
+            <w:shd w:val="clear" w:color="auto" w:fill="8DD873" w:themeFill="accent6" w:themeFillTint="99"/>
           </w:tcPr>
           <w:p>
             <w:pPr>
@@ -205,19 +280,20 @@
         <w:tc>
           <w:tcPr>
             <w:tcW w:w="7790" w:type="dxa"/>
-            <w:shd w:val="clear" w:color="auto" w:fill="BFBFBF" w:themeFill="background1" w:themeFillShade="BF"/>
+            <w:shd w:val="clear" w:color="auto" w:fill="D9F2D0" w:themeFill="accent6" w:themeFillTint="33"/>
           </w:tcPr>
           <w:p>
             <w:r>
-              <w:t xml:space="preserve">Effekter, som gør min projekt mere levende </w:t>
+              <w:t xml:space="preserve">Separate </w:t>
             </w:r>
-            <w:proofErr w:type="spellStart"/>
             <w:r>
-              <w:t>ala</w:t>
+              <w:t>HTML</w:t>
             </w:r>
-            <w:proofErr w:type="spellEnd"/>
             <w:r>
-              <w:t xml:space="preserve"> brug af JavaScript</w:t>
+              <w:t>-sider</w:t>
+            </w:r>
+            <w:r>
+              <w:t xml:space="preserve"> for hver af min nav-elementer</w:t>
             </w:r>
           </w:p>
         </w:tc>
@@ -226,7 +302,7 @@
         <w:tc>
           <w:tcPr>
             <w:tcW w:w="1838" w:type="dxa"/>
-            <w:shd w:val="clear" w:color="auto" w:fill="808080" w:themeFill="background1" w:themeFillShade="80"/>
+            <w:shd w:val="clear" w:color="auto" w:fill="8DD873" w:themeFill="accent6" w:themeFillTint="99"/>
           </w:tcPr>
           <w:p>
             <w:pPr>
@@ -249,11 +325,17 @@
         <w:tc>
           <w:tcPr>
             <w:tcW w:w="7790" w:type="dxa"/>
-            <w:shd w:val="clear" w:color="auto" w:fill="BFBFBF" w:themeFill="background1" w:themeFillShade="BF"/>
+            <w:shd w:val="clear" w:color="auto" w:fill="D9F2D0" w:themeFill="accent6" w:themeFillTint="33"/>
           </w:tcPr>
           <w:p>
             <w:r>
-              <w:t xml:space="preserve">Igen JavaScript, da det er udenfor </w:t>
+              <w:t>JavaScript, da det er udenfor</w:t>
+            </w:r>
+            <w:r>
+              <w:t xml:space="preserve"> min</w:t>
+            </w:r>
+            <w:r>
+              <w:t xml:space="preserve"> </w:t>
             </w:r>
             <w:proofErr w:type="spellStart"/>
             <w:r>
@@ -270,6 +352,10 @@
     <w:p>
       <w:pPr>
         <w:jc w:val="both"/>
+        <w:rPr>
+          <w:sz w:val="28"/>
+          <w:szCs w:val="28"/>
+        </w:rPr>
       </w:pPr>
     </w:p>
     <w:p>
@@ -278,6 +364,8 @@
         <w:rPr>
           <w:b/>
           <w:bCs/>
+          <w:sz w:val="28"/>
+          <w:szCs w:val="28"/>
           <w:u w:val="single"/>
         </w:rPr>
       </w:pPr>
@@ -285,9 +373,160 @@
         <w:rPr>
           <w:b/>
           <w:bCs/>
+          <w:sz w:val="28"/>
+          <w:szCs w:val="28"/>
           <w:u w:val="single"/>
         </w:rPr>
         <w:t>Refleksion</w:t>
+      </w:r>
+    </w:p>
+    <w:p>
+      <w:pPr>
+        <w:pStyle w:val="pdq2pgselectionanchorcontainer"/>
+        <w:jc w:val="both"/>
+        <w:rPr>
+          <w:rFonts w:asciiTheme="minorHAnsi" w:hAnsiTheme="minorHAnsi"/>
+          <w:color w:val="000000"/>
+        </w:rPr>
+      </w:pPr>
+      <w:r>
+        <w:rPr>
+          <w:rFonts w:asciiTheme="minorHAnsi" w:hAnsiTheme="minorHAnsi"/>
+          <w:color w:val="000000"/>
+        </w:rPr>
+        <w:t xml:space="preserve">Overordnet synes jeg, at projektet er gået godt, og jeg har fået lavet en portfolio, som jeg er </w:t>
+      </w:r>
+      <w:r>
+        <w:rPr>
+          <w:rFonts w:asciiTheme="minorHAnsi" w:hAnsiTheme="minorHAnsi"/>
+          <w:color w:val="000000"/>
+        </w:rPr>
+        <w:t xml:space="preserve">okay </w:t>
+      </w:r>
+      <w:r>
+        <w:rPr>
+          <w:rFonts w:asciiTheme="minorHAnsi" w:hAnsiTheme="minorHAnsi"/>
+          <w:color w:val="000000"/>
+        </w:rPr>
+        <w:t>tilfreds med. Jeg fik lavet de vigtigste dele, som jeg havde planlagt, blandt andet en forside, navigation, sektioner om mig, uddannelse og erhvervserfaring samt en footer med kontaktoplysninger. Jeg synes også, at det visuelle udtryk blev nogenlunde, som jeg havde forestillet mig især i forhold til farvepalette, typografi, billeder, ikoner og logo.</w:t>
+      </w:r>
+    </w:p>
+    <w:p>
+      <w:pPr>
+        <w:pStyle w:val="pdq2pgselectionanchorcontainer"/>
+        <w:jc w:val="both"/>
+        <w:rPr>
+          <w:rFonts w:asciiTheme="minorHAnsi" w:hAnsiTheme="minorHAnsi"/>
+          <w:color w:val="000000"/>
+        </w:rPr>
+      </w:pPr>
+      <w:r>
+        <w:rPr>
+          <w:rFonts w:asciiTheme="minorHAnsi" w:hAnsiTheme="minorHAnsi"/>
+          <w:color w:val="000000"/>
+        </w:rPr>
+        <w:t>Der var dog nogle ting, som ikke gik helt efter planen. Jeg havde blandt andet en idé om at lave flere forskellige HTML-sider, så man gennem navigationen kunne komme ind på separate sider. Det nåede jeg ikke, fordi CSS og især responsivt design</w:t>
+      </w:r>
+      <w:r>
+        <w:rPr>
+          <w:rFonts w:asciiTheme="minorHAnsi" w:hAnsiTheme="minorHAnsi"/>
+          <w:color w:val="000000"/>
+        </w:rPr>
+        <w:t xml:space="preserve">, </w:t>
+      </w:r>
+      <w:r>
+        <w:rPr>
+          <w:rFonts w:asciiTheme="minorHAnsi" w:hAnsiTheme="minorHAnsi"/>
+          <w:color w:val="000000"/>
+        </w:rPr>
+        <w:t>så hjemmesiden også fungerede på mobil</w:t>
+      </w:r>
+      <w:r>
+        <w:rPr>
+          <w:rFonts w:asciiTheme="minorHAnsi" w:hAnsiTheme="minorHAnsi"/>
+          <w:color w:val="000000"/>
+        </w:rPr>
+        <w:t>, t</w:t>
+      </w:r>
+      <w:r>
+        <w:rPr>
+          <w:rFonts w:asciiTheme="minorHAnsi" w:hAnsiTheme="minorHAnsi"/>
+          <w:color w:val="000000"/>
+        </w:rPr>
+        <w:t>og længere tid end forventet. Jeg valgte derfor i stedet at samle indholdet på én side og bruge navigationen til at scrolle ned til de forskellige sektioner.</w:t>
+      </w:r>
+    </w:p>
+    <w:p>
+      <w:pPr>
+        <w:pStyle w:val="NormalWeb"/>
+        <w:jc w:val="both"/>
+        <w:rPr>
+          <w:rFonts w:asciiTheme="minorHAnsi" w:hAnsiTheme="minorHAnsi"/>
+          <w:color w:val="000000"/>
+        </w:rPr>
+      </w:pPr>
+      <w:r>
+        <w:rPr>
+          <w:rFonts w:asciiTheme="minorHAnsi" w:hAnsiTheme="minorHAnsi"/>
+          <w:color w:val="000000"/>
+        </w:rPr>
+        <w:t>Jeg undervurderede også, hvor meget tid der skulle bruges på at få hjemmesiden til at fungere på forskellige skærmstørrelser og browsere. Flere gange så hjemmesiden forskellig ud i Chrome, Safari og på mobil, og derfor måtte jeg bruge ekstra tid på media queries og justeringer af størrelser og layout. Det gjorde, at jeg måtte re-estimere nogle af opgaverne undervejs.</w:t>
+      </w:r>
+    </w:p>
+    <w:p>
+      <w:pPr>
+        <w:pStyle w:val="NormalWeb"/>
+        <w:jc w:val="both"/>
+        <w:rPr>
+          <w:rFonts w:asciiTheme="minorHAnsi" w:hAnsiTheme="minorHAnsi"/>
+          <w:color w:val="000000"/>
+        </w:rPr>
+      </w:pPr>
+      <w:r>
+        <w:rPr>
+          <w:rFonts w:asciiTheme="minorHAnsi" w:hAnsiTheme="minorHAnsi"/>
+          <w:color w:val="000000"/>
+        </w:rPr>
+        <w:t>Min WBS og MoSCoW-prioritering hjalp mig med at fokusere på de vigtigste krav først. Da tiden blev mere presset, valgte jeg derfor at prioritere HTML, CSS, responsivt design og indhold frem for ekstra</w:t>
+      </w:r>
+      <w:r>
+        <w:rPr>
+          <w:rFonts w:asciiTheme="minorHAnsi" w:hAnsiTheme="minorHAnsi"/>
+          <w:color w:val="000000"/>
+        </w:rPr>
+        <w:t xml:space="preserve"> CSS-effekter </w:t>
+      </w:r>
+      <w:r>
+        <w:rPr>
+          <w:rFonts w:asciiTheme="minorHAnsi" w:hAnsiTheme="minorHAnsi"/>
+          <w:color w:val="000000"/>
+        </w:rPr>
+        <w:t>og flere HTML-sider.</w:t>
+      </w:r>
+    </w:p>
+    <w:p>
+      <w:pPr>
+        <w:pStyle w:val="NormalWeb"/>
+        <w:jc w:val="both"/>
+        <w:rPr>
+          <w:rFonts w:asciiTheme="minorHAnsi" w:hAnsiTheme="minorHAnsi"/>
+          <w:color w:val="000000"/>
+        </w:rPr>
+      </w:pPr>
+      <w:r>
+        <w:rPr>
+          <w:rFonts w:asciiTheme="minorHAnsi" w:hAnsiTheme="minorHAnsi"/>
+          <w:color w:val="000000"/>
+        </w:rPr>
+        <w:lastRenderedPageBreak/>
+        <w:t>Hvis jeg skulle lave projektet igen, ville jeg teste hjemmesiden på mobil og forskellige browsere tidligere i processen. Jeg ville også lave en mere realistisk tidsestimering af CSS-delen, da den tog væsentligt længere tid, end jeg havde forventet.</w:t>
+      </w:r>
+      <w:r>
+        <w:rPr>
+          <w:rFonts w:asciiTheme="minorHAnsi" w:hAnsiTheme="minorHAnsi"/>
+          <w:color w:val="000000"/>
+        </w:rPr>
+        <w:t xml:space="preserve"> Jeg endte også med at bruge unødvendig meget tid på at ændre mit design undervejs, da jeg ikke havde fastlagt det inden, så det vil jeg også ændre til næste gang.</w:t>
       </w:r>
     </w:p>
     <w:p>
@@ -303,6 +542,56 @@
     </w:sectPr>
   </w:body>
 </w:document>
+</file>
+
+<file path=word/endnotes.xml><?xml version="1.0" encoding="utf-8"?>
+<w:endnotes xmlns:wpc="http://schemas.microsoft.com/office/word/2010/wordprocessingCanvas" xmlns:cx="http://schemas.microsoft.com/office/drawing/2014/chartex" xmlns:cx1="http://schemas.microsoft.com/office/drawing/2015/9/8/chartex" xmlns:cx2="http://schemas.microsoft.com/office/drawing/2015/10/21/chartex" xmlns:cx3="http://schemas.microsoft.com/office/drawing/2016/5/9/chartex" xmlns:cx4="http://schemas.microsoft.com/office/drawing/2016/5/10/chartex" xmlns:cx5="http://schemas.microsoft.com/office/drawing/2016/5/11/chartex" xmlns:cx6="http://schemas.microsoft.com/office/drawing/2016/5/12/chartex" xmlns:cx7="http://schemas.microsoft.com/office/drawing/2016/5/13/chartex" xmlns:cx8="http://schemas.microsoft.com/office/drawing/2016/5/14/chartex" xmlns:mc="http://schemas.openxmlformats.org/markup-compatibility/2006" xmlns:m="http://schemas.openxmlformats.org/officeDocument/2006/math" xmlns:aink="http://schemas.microsoft.com/office/drawing/2016/ink" xmlns:am3d="http://schemas.microsoft.com/office/drawing/2017/model3d" xmlns:oel="http://schemas.microsoft.com/office/2019/extlst" xmlns:r="http://schemas.openxmlformats.org/officeDocument/2006/relationships" xmlns:wp14="http://schemas.microsoft.com/office/word/2010/wordprocessingDrawing" xmlns:wp="http://schemas.openxmlformats.org/drawingml/2006/wordprocessingDrawing" xmlns:wpg="http://schemas.microsoft.com/office/word/2010/wordprocessingGroup" xmlns:wpi="http://schemas.microsoft.com/office/word/2010/wordprocessingInk" xmlns:wps="http://schemas.microsoft.com/office/word/2010/wordprocessingShape" xmlns:o="urn:schemas-microsoft-com:office:office" xmlns:v="urn:schemas-microsoft-com:vml" xmlns:w10="urn:schemas-microsoft-com:office:word" xmlns:w="http://schemas.openxmlformats.org/wordprocessingml/2006/main" xmlns:w14="http://schemas.microsoft.com/office/word/2010/wordml" xmlns:w15="http://schemas.microsoft.com/office/word/2012/wordml" xmlns:w16cex="http://schemas.microsoft.com/office/word/2018/wordml/cex" xmlns:w16cid="http://schemas.microsoft.com/office/word/2016/wordml/cid" xmlns:w16="http://schemas.microsoft.com/office/word/2018/wordml" xmlns:w16sdtdh="http://schemas.microsoft.com/office/word/2020/wordml/sdtdatahash" xmlns:w16sdtfl="http://schemas.microsoft.com/office/word/2024/wordml/sdtformatlock" xmlns:w16se="http://schemas.microsoft.com/office/word/2015/wordml/symex" xmlns:w16du="http://schemas.microsoft.com/office/word/2023/wordml/word16du" xmlns:wne="http://schemas.microsoft.com/office/word/2006/wordml" mc:Ignorable="w14 w15 w16se w16cid w16 w16cex w16sdtdh w16sdtfl w16du wp14">
+  <w:endnote w:type="separator" w:id="-1">
+    <w:p>
+      <w:pPr>
+        <w:spacing w:after="0" w:line="240" w:lineRule="auto"/>
+      </w:pPr>
+      <w:r>
+        <w:separator/>
+      </w:r>
+    </w:p>
+  </w:endnote>
+  <w:endnote w:type="continuationSeparator" w:id="0">
+    <w:p>
+      <w:pPr>
+        <w:spacing w:after="0" w:line="240" w:lineRule="auto"/>
+      </w:pPr>
+      <w:r>
+        <w:continuationSeparator/>
+      </w:r>
+    </w:p>
+  </w:endnote>
+</w:endnotes>
+</file>
+
+<file path=word/footnotes.xml><?xml version="1.0" encoding="utf-8"?>
+<w:footnotes xmlns:wpc="http://schemas.microsoft.com/office/word/2010/wordprocessingCanvas" xmlns:cx="http://schemas.microsoft.com/office/drawing/2014/chartex" xmlns:cx1="http://schemas.microsoft.com/office/drawing/2015/9/8/chartex" xmlns:cx2="http://schemas.microsoft.com/office/drawing/2015/10/21/chartex" xmlns:cx3="http://schemas.microsoft.com/office/drawing/2016/5/9/chartex" xmlns:cx4="http://schemas.microsoft.com/office/drawing/2016/5/10/chartex" xmlns:cx5="http://schemas.microsoft.com/office/drawing/2016/5/11/chartex" xmlns:cx6="http://schemas.microsoft.com/office/drawing/2016/5/12/chartex" xmlns:cx7="http://schemas.microsoft.com/office/drawing/2016/5/13/chartex" xmlns:cx8="http://schemas.microsoft.com/office/drawing/2016/5/14/chartex" xmlns:mc="http://schemas.openxmlformats.org/markup-compatibility/2006" xmlns:m="http://schemas.openxmlformats.org/officeDocument/2006/math" xmlns:aink="http://schemas.microsoft.com/office/drawing/2016/ink" xmlns:am3d="http://schemas.microsoft.com/office/drawing/2017/model3d" xmlns:oel="http://schemas.microsoft.com/office/2019/extlst" xmlns:r="http://schemas.openxmlformats.org/officeDocument/2006/relationships" xmlns:wp14="http://schemas.microsoft.com/office/word/2010/wordprocessingDrawing" xmlns:wp="http://schemas.openxmlformats.org/drawingml/2006/wordprocessingDrawing" xmlns:wpg="http://schemas.microsoft.com/office/word/2010/wordprocessingGroup" xmlns:wpi="http://schemas.microsoft.com/office/word/2010/wordprocessingInk" xmlns:wps="http://schemas.microsoft.com/office/word/2010/wordprocessingShape" xmlns:o="urn:schemas-microsoft-com:office:office" xmlns:v="urn:schemas-microsoft-com:vml" xmlns:w10="urn:schemas-microsoft-com:office:word" xmlns:w="http://schemas.openxmlformats.org/wordprocessingml/2006/main" xmlns:w14="http://schemas.microsoft.com/office/word/2010/wordml" xmlns:w15="http://schemas.microsoft.com/office/word/2012/wordml" xmlns:w16cex="http://schemas.microsoft.com/office/word/2018/wordml/cex" xmlns:w16cid="http://schemas.microsoft.com/office/word/2016/wordml/cid" xmlns:w16="http://schemas.microsoft.com/office/word/2018/wordml" xmlns:w16sdtdh="http://schemas.microsoft.com/office/word/2020/wordml/sdtdatahash" xmlns:w16sdtfl="http://schemas.microsoft.com/office/word/2024/wordml/sdtformatlock" xmlns:w16se="http://schemas.microsoft.com/office/word/2015/wordml/symex" xmlns:w16du="http://schemas.microsoft.com/office/word/2023/wordml/word16du" xmlns:wne="http://schemas.microsoft.com/office/word/2006/wordml" mc:Ignorable="w14 w15 w16se w16cid w16 w16cex w16sdtdh w16sdtfl w16du wp14">
+  <w:footnote w:type="separator" w:id="-1">
+    <w:p>
+      <w:pPr>
+        <w:spacing w:after="0" w:line="240" w:lineRule="auto"/>
+      </w:pPr>
+      <w:r>
+        <w:separator/>
+      </w:r>
+    </w:p>
+  </w:footnote>
+  <w:footnote w:type="continuationSeparator" w:id="0">
+    <w:p>
+      <w:pPr>
+        <w:spacing w:after="0" w:line="240" w:lineRule="auto"/>
+      </w:pPr>
+      <w:r>
+        <w:continuationSeparator/>
+      </w:r>
+    </w:p>
+  </w:footnote>
+</w:footnotes>
 </file>
 
 <file path=word/numbering.xml><?xml version="1.0" encoding="utf-8"?>
@@ -992,7 +1281,6 @@
     <w:next w:val="Normal"/>
     <w:link w:val="Overskrift3Tegn"/>
     <w:uiPriority w:val="9"/>
-    <w:semiHidden/>
     <w:unhideWhenUsed/>
     <w:qFormat/>
     <w:rsid w:val="00005E4D"/>
@@ -1200,7 +1488,6 @@
     <w:basedOn w:val="Standardskrifttypeiafsnit"/>
     <w:link w:val="Overskrift3"/>
     <w:uiPriority w:val="9"/>
-    <w:semiHidden/>
     <w:rsid w:val="00005E4D"/>
     <w:rPr>
       <w:rFonts w:eastAsiaTheme="majorEastAsia" w:cstheme="majorBidi"/>
@@ -1491,6 +1778,81 @@
         <w:insideV w:val="single" w:sz="4" w:space="0" w:color="auto"/>
       </w:tblBorders>
     </w:tblPr>
+  </w:style>
+  <w:style w:type="paragraph" w:styleId="NormalWeb">
+    <w:name w:val="Normal (Web)"/>
+    <w:basedOn w:val="Normal"/>
+    <w:uiPriority w:val="99"/>
+    <w:semiHidden/>
+    <w:unhideWhenUsed/>
+    <w:rsid w:val="00BC74E3"/>
+    <w:pPr>
+      <w:spacing w:before="100" w:beforeAutospacing="1" w:after="100" w:afterAutospacing="1" w:line="240" w:lineRule="auto"/>
+    </w:pPr>
+    <w:rPr>
+      <w:rFonts w:ascii="Times New Roman" w:eastAsia="Times New Roman" w:hAnsi="Times New Roman" w:cs="Times New Roman"/>
+      <w:kern w:val="0"/>
+      <w:lang w:eastAsia="da-DK"/>
+      <w14:ligatures w14:val="none"/>
+    </w:rPr>
+  </w:style>
+  <w:style w:type="paragraph" w:customStyle="1" w:styleId="pdq2pgselectionanchorcontainer">
+    <w:name w:val="pdq2pg_selectionanchorcontainer"/>
+    <w:basedOn w:val="Normal"/>
+    <w:rsid w:val="00BC74E3"/>
+    <w:pPr>
+      <w:spacing w:before="100" w:beforeAutospacing="1" w:after="100" w:afterAutospacing="1" w:line="240" w:lineRule="auto"/>
+    </w:pPr>
+    <w:rPr>
+      <w:rFonts w:ascii="Times New Roman" w:eastAsia="Times New Roman" w:hAnsi="Times New Roman" w:cs="Times New Roman"/>
+      <w:kern w:val="0"/>
+      <w:lang w:eastAsia="da-DK"/>
+      <w14:ligatures w14:val="none"/>
+    </w:rPr>
+  </w:style>
+  <w:style w:type="paragraph" w:styleId="Sidehoved">
+    <w:name w:val="header"/>
+    <w:basedOn w:val="Normal"/>
+    <w:link w:val="SidehovedTegn"/>
+    <w:uiPriority w:val="99"/>
+    <w:unhideWhenUsed/>
+    <w:rsid w:val="004D087E"/>
+    <w:pPr>
+      <w:tabs>
+        <w:tab w:val="center" w:pos="4819"/>
+        <w:tab w:val="right" w:pos="9638"/>
+      </w:tabs>
+      <w:spacing w:after="0" w:line="240" w:lineRule="auto"/>
+    </w:pPr>
+  </w:style>
+  <w:style w:type="character" w:customStyle="1" w:styleId="SidehovedTegn">
+    <w:name w:val="Sidehoved Tegn"/>
+    <w:basedOn w:val="Standardskrifttypeiafsnit"/>
+    <w:link w:val="Sidehoved"/>
+    <w:uiPriority w:val="99"/>
+    <w:rsid w:val="004D087E"/>
+  </w:style>
+  <w:style w:type="paragraph" w:styleId="Sidefod">
+    <w:name w:val="footer"/>
+    <w:basedOn w:val="Normal"/>
+    <w:link w:val="SidefodTegn"/>
+    <w:uiPriority w:val="99"/>
+    <w:unhideWhenUsed/>
+    <w:rsid w:val="004D087E"/>
+    <w:pPr>
+      <w:tabs>
+        <w:tab w:val="center" w:pos="4819"/>
+        <w:tab w:val="right" w:pos="9638"/>
+      </w:tabs>
+      <w:spacing w:after="0" w:line="240" w:lineRule="auto"/>
+    </w:pPr>
+  </w:style>
+  <w:style w:type="character" w:customStyle="1" w:styleId="SidefodTegn">
+    <w:name w:val="Sidefod Tegn"/>
+    <w:basedOn w:val="Standardskrifttypeiafsnit"/>
+    <w:link w:val="Sidefod"/>
+    <w:uiPriority w:val="99"/>
+    <w:rsid w:val="004D087E"/>
   </w:style>
 </w:styles>
 </file>

</xml_diff>